<commit_message>
Weekly Report, Initial Docker notes
</commit_message>
<xml_diff>
--- a/Weekly Reports/BCIS309 Weekly Report week04 - McIntosh, Daniel.docx
+++ b/Weekly Reports/BCIS309 Weekly Report week04 - McIntosh, Daniel.docx
@@ -827,7 +827,27 @@
           <w:sz w:val="20"/>
           <w:szCs w:val="20"/>
         </w:rPr>
-        <w:t>, Tuesday 12pm with Abdul</w:t>
+        <w:t xml:space="preserve">, </w:t>
+      </w:r>
+      <w:r>
+        <w:rPr>
+          <w:rFonts w:ascii="Century Gothic" w:hAnsi="Century Gothic"/>
+          <w:b/>
+          <w:bCs/>
+          <w:sz w:val="20"/>
+          <w:szCs w:val="20"/>
+        </w:rPr>
+        <w:t>Monday</w:t>
+      </w:r>
+      <w:r>
+        <w:rPr>
+          <w:rFonts w:ascii="Century Gothic" w:hAnsi="Century Gothic"/>
+          <w:b/>
+          <w:bCs/>
+          <w:sz w:val="20"/>
+          <w:szCs w:val="20"/>
+        </w:rPr>
+        <w:t xml:space="preserve"> 12pm with Abdul</w:t>
       </w:r>
     </w:p>
     <w:p>
@@ -1007,23 +1027,13 @@
               </w:rPr>
               <w:t xml:space="preserve">Project Proposal </w:t>
             </w:r>
-            <w:proofErr w:type="gramStart"/>
-            <w:r>
-              <w:rPr>
-                <w:rFonts w:ascii="Century Gothic" w:hAnsi="Century Gothic"/>
-                <w:sz w:val="22"/>
-                <w:szCs w:val="22"/>
-              </w:rPr>
-              <w:t>not complete</w:t>
-            </w:r>
-            <w:proofErr w:type="gramEnd"/>
-            <w:r>
-              <w:rPr>
-                <w:rFonts w:ascii="Century Gothic" w:hAnsi="Century Gothic"/>
-                <w:sz w:val="22"/>
-                <w:szCs w:val="22"/>
-              </w:rPr>
-              <w:t xml:space="preserve"> for review</w:t>
+            <w:r>
+              <w:rPr>
+                <w:rFonts w:ascii="Century Gothic" w:hAnsi="Century Gothic"/>
+                <w:sz w:val="22"/>
+                <w:szCs w:val="22"/>
+              </w:rPr>
+              <w:t>not complete for review</w:t>
             </w:r>
           </w:p>
         </w:tc>

</xml_diff>